<commit_message>
Evidentiary-Deficit v2: co-author byline for Bar, humanize, Ubayet ack, pitch
Promote byline to 'By Phillip Wikes and Gabriela Bar' with dual bios;
credit Ubayet Hossain as a contributor acknowledgment (not co-author of
the legal argument); humanize with a first-person practitioner opening
and varied rhythm; rebuild the Word doc. Add the co-author pitch email
(offers Bar Section V, proposes OBLB, earned-authorship framing). No long
dashes, no 'frequently'. Tracker logged.

Co-Authored-By: Claude Opus 4.8 <noreply@anthropic.com>
Claude-Session: https://claude.ai/code/session_01W9UtE7X76spacWeSvBH7tv
</commit_message>
<xml_diff>
--- a/research/JRS_Article_Evidentiary_Deficit.docx
+++ b/research/JRS_Article_Evidentiary_Deficit.docx
@@ -37,7 +37,7 @@
     </w:p>
     <w:p>
       <w:pPr>
-        <w:spacing w:after="80"/>
+        <w:spacing w:after="100"/>
       </w:pPr>
       <w:r>
         <w:rPr>
@@ -53,35 +53,37 @@
     </w:p>
     <w:p>
       <w:pPr>
+        <w:spacing w:after="30"/>
+      </w:pPr>
+      <w:r>
+        <w:rPr>
+          <w:rFonts w:ascii="Georgia" w:cs="Georgia" w:eastAsia="Georgia" w:hAnsi="Georgia"/>
+          <w:b/>
+          <w:bCs/>
+          <w:color w:val="141414"/>
+          <w:sz w:val="26"/>
+          <w:szCs w:val="26"/>
+        </w:rPr>
+        <w:t xml:space="preserve">By Phillip Wikes and Gabriela Bar</w:t>
+      </w:r>
+    </w:p>
+    <w:p>
+      <w:pPr>
         <w:pBdr>
-          <w:bottom w:val="single" w:color="7A5E28" w:sz="6" w:space="6"/>
+          <w:bottom w:val="single" w:color="7A5E28" w:sz="6" w:space="8"/>
         </w:pBdr>
-        <w:spacing w:after="40"/>
-      </w:pPr>
-      <w:r>
-        <w:rPr>
-          <w:rFonts w:ascii="Georgia" w:cs="Georgia" w:eastAsia="Georgia" w:hAnsi="Georgia"/>
-          <w:color w:val="141414"/>
-          <w:sz w:val="21"/>
-          <w:szCs w:val="21"/>
-        </w:rPr>
-        <w:t xml:space="preserve">By Phillip Wikes, AI Governance and Cognitive Risk Advisor</w:t>
-      </w:r>
-    </w:p>
-    <w:p>
-      <w:pPr>
-        <w:spacing w:after="120"/>
+        <w:spacing w:after="130"/>
       </w:pPr>
       <w:r>
         <w:rPr>
           <w:rFonts w:ascii="Georgia" w:cs="Georgia" w:eastAsia="Georgia" w:hAnsi="Georgia"/>
           <w:i/>
           <w:iCs/>
-          <w:color w:val="7A5E28"/>
+          <w:color w:val="555555"/>
           <w:sz w:val="18"/>
           <w:szCs w:val="18"/>
         </w:rPr>
-        <w:t xml:space="preserve">Draft prepared for review and co-authoring with Gabriela Bar, PhD, Attorney at Law (EU AI law).</w:t>
+        <w:t xml:space="preserve">Phillip Wikes, AI Governance and Cognitive Risk Advisor, former Lead Civil Rights Officer, Maryland Commission on Civil Rights.  Gabriela Bar, PhD, Attorney at Law, founder of Gabriela Bar Law and AI (Wroclaw), advising on trustworthy AI and data-protection law.</w:t>
       </w:r>
     </w:p>
     <w:p>
@@ -113,6 +115,21 @@
           <w:sz w:val="21"/>
           <w:szCs w:val="21"/>
         </w:rPr>
+        <w:t xml:space="preserve">One of us spent more than a decade reading discrimination files for a state civil rights agency. The cases that caused the most worry were rarely the ones with an obvious flaw. They were the ones where the file read cleanly, the conclusion sat neatly at the end, and nothing beneath it explained how anyone had arrived there. A record can look finished and still be hollow.</w:t>
+      </w:r>
+    </w:p>
+    <w:p>
+      <w:pPr>
+        <w:spacing w:after="130"/>
+        <w:jc w:val="both"/>
+      </w:pPr>
+      <w:r>
+        <w:rPr>
+          <w:rFonts w:ascii="Georgia" w:cs="Georgia" w:eastAsia="Georgia" w:hAnsi="Georgia"/>
+          <w:color w:val="1a1a1a"/>
+          <w:sz w:val="21"/>
+          <w:szCs w:val="21"/>
+        </w:rPr>
         <w:t xml:space="preserve">In employment disputes, the written record carries primary evidentiary weight. When it falls short, every other element of the case becomes harder to defend.</w:t>
       </w:r>
     </w:p>
@@ -322,7 +339,7 @@
           <w:sz w:val="21"/>
           <w:szCs w:val="21"/>
         </w:rPr>
-        <w:t xml:space="preserve">When the same tool generates both the narrative and its supporting justification, the record becomes self-referential and can be functionally indistinguishable from post hoc rationalization. A manager prompts the model to draft a termination justification, then prompts the same model to generate the supporting facts. The resulting file is internally consistent but cannot be tied to independent evidence. In discovery, unsupported assertions are treated as post hoc rationalization, particularly where the drafting record shows AI-generated narrative being introduced after the underlying decision was already made.</w:t>
+        <w:t xml:space="preserve">When the same tool generates both the narrative and its supporting justification, the record becomes self-referential and can be functionally indistinguishable from post hoc rationalization. Picture a manager who prompts the model to draft a termination justification, then prompts the same model to supply the supporting facts. The resulting file is internally consistent, and it cannot be tied to independent evidence. In discovery, unsupported assertions are treated as post hoc rationalization, particularly where the drafting record shows AI-generated narrative introduced after the underlying decision was already made.</w:t>
       </w:r>
     </w:p>
     <w:p>
@@ -416,7 +433,7 @@
           <w:sz w:val="21"/>
           <w:szCs w:val="21"/>
         </w:rPr>
-        <w:t xml:space="preserve">In the European Union, the same gap intersects two regimes at once. Under the GDPR, the accountability principle expects an organization to demonstrate how personal data was processed; a record whose provenance cannot be shown is difficult to reconcile with that duty and with records-of-processing obligations. Under the EU AI Act, high-risk uses carry record-keeping, logging, and technical-documentation expectations intended to make automated and AI-assisted processing auditable after the fact. An organization that cannot reconstruct how an AI-assisted record was produced faces exposure on both fronts at the same time. </w:t>
+        <w:t xml:space="preserve">In the European Union, the same gap intersects two regimes at once. Under the GDPR, the accountability principle expects an organization to demonstrate how personal data was processed; a record whose provenance cannot be shown is difficult to reconcile with that duty and with records-of-processing obligations. Under the EU AI Act, high-risk uses carry record-keeping, logging, and technical-documentation expectations intended to make automated and AI-assisted processing auditable after the fact. An organization that cannot reconstruct how an AI-assisted record was produced faces exposure on both fronts at once. </w:t>
       </w:r>
       <w:r>
         <w:rPr>
@@ -921,67 +938,91 @@
           <w:sz w:val="24"/>
           <w:szCs w:val="24"/>
         </w:rPr>
-        <w:t xml:space="preserve">About the Author</w:t>
-      </w:r>
-    </w:p>
-    <w:p>
-      <w:pPr>
-        <w:spacing w:after="130"/>
-        <w:jc w:val="both"/>
-      </w:pPr>
-      <w:r>
-        <w:rPr>
-          <w:rFonts w:ascii="Georgia" w:cs="Georgia" w:eastAsia="Georgia" w:hAnsi="Georgia"/>
-          <w:color w:val="1a1a1a"/>
-          <w:sz w:val="21"/>
-          <w:szCs w:val="21"/>
-        </w:rPr>
-        <w:t xml:space="preserve">Phillip Wikes is an AI Governance and Cognitive Risk Advisor focused on documentation integrity, evidentiary traceability, and record-level controls in AI-assisted environments.</w:t>
-      </w:r>
-    </w:p>
-    <w:p>
-      <w:pPr>
-        <w:spacing w:after="130"/>
-        <w:jc w:val="both"/>
-      </w:pPr>
-      <w:r>
-        <w:rPr>
-          <w:rFonts w:ascii="Georgia" w:cs="Georgia" w:eastAsia="Georgia" w:hAnsi="Georgia"/>
-          <w:color w:val="1a1a1a"/>
-          <w:sz w:val="21"/>
-          <w:szCs w:val="21"/>
-        </w:rPr>
-        <w:t xml:space="preserve">From 2012 to 2025, he served as a Lead Civil Rights Officer at the Maryland Commission on Civil Rights, evaluating discrimination complaints and resolving matters through investigation, mediation, and structured fact-finding under federal HUD and EEOC frameworks.</w:t>
-      </w:r>
-    </w:p>
-    <w:p>
-      <w:pPr>
-        <w:spacing w:after="130"/>
-        <w:jc w:val="both"/>
-      </w:pPr>
-      <w:r>
-        <w:rPr>
-          <w:rFonts w:ascii="Georgia" w:cs="Georgia" w:eastAsia="Georgia" w:hAnsi="Georgia"/>
-          <w:color w:val="1a1a1a"/>
-          <w:sz w:val="21"/>
-          <w:szCs w:val="21"/>
-        </w:rPr>
-        <w:t xml:space="preserve">He developed the Justification Review Standard (JRS), a structured documentation review instrument built for practitioner application within existing HR, compliance, investigations, audit, and legal review workflows, and named the risk it addresses: Decision Reconstruction Risk (DRR).</w:t>
-      </w:r>
-    </w:p>
-    <w:p>
-      <w:pPr>
-        <w:spacing w:after="130"/>
-        <w:jc w:val="both"/>
-      </w:pPr>
-      <w:r>
-        <w:rPr>
-          <w:rFonts w:ascii="Georgia" w:cs="Georgia" w:eastAsia="Georgia" w:hAnsi="Georgia"/>
-          <w:color w:val="1a1a1a"/>
-          <w:sz w:val="21"/>
-          <w:szCs w:val="21"/>
-        </w:rPr>
-        <w:t xml:space="preserve">He also co-developed cognitive-behavioral programs used in educational and juvenile justice settings, and holds an M.S. in Negotiation and Conflict Management.</w:t>
+        <w:t xml:space="preserve">Acknowledgment</w:t>
+      </w:r>
+    </w:p>
+    <w:p>
+      <w:pPr>
+        <w:spacing w:after="130"/>
+        <w:jc w:val="both"/>
+      </w:pPr>
+      <w:r>
+        <w:rPr>
+          <w:rFonts w:ascii="Georgia" w:cs="Georgia" w:eastAsia="Georgia" w:hAnsi="Georgia"/>
+          <w:color w:val="1a1a1a"/>
+          <w:sz w:val="21"/>
+          <w:szCs w:val="21"/>
+        </w:rPr>
+        <w:t xml:space="preserve">The reliability and reproducibility methodology behind the validation figures cited above was designed by Ubayet Hossain, FRM, Associate Director (Model Validation), KPMG India.</w:t>
+      </w:r>
+    </w:p>
+    <w:p>
+      <w:pPr>
+        <w:pStyle w:val="Heading2"/>
+        <w:spacing w:after="90" w:before="220"/>
+      </w:pPr>
+      <w:r>
+        <w:rPr>
+          <w:rFonts w:ascii="Georgia" w:cs="Georgia" w:eastAsia="Georgia" w:hAnsi="Georgia"/>
+          <w:b/>
+          <w:bCs/>
+          <w:color w:val="141414"/>
+          <w:sz w:val="24"/>
+          <w:szCs w:val="24"/>
+        </w:rPr>
+        <w:t xml:space="preserve">About the Authors</w:t>
+      </w:r>
+    </w:p>
+    <w:p>
+      <w:pPr>
+        <w:spacing w:after="130"/>
+        <w:jc w:val="both"/>
+      </w:pPr>
+      <w:r>
+        <w:rPr>
+          <w:rFonts w:ascii="Georgia" w:cs="Georgia" w:eastAsia="Georgia" w:hAnsi="Georgia"/>
+          <w:b/>
+          <w:bCs/>
+          <w:color w:val="1a1a1a"/>
+          <w:sz w:val="21"/>
+          <w:szCs w:val="21"/>
+        </w:rPr>
+        <w:t xml:space="preserve">Gabriela Bar, PhD,</w:t>
+      </w:r>
+      <w:r>
+        <w:rPr>
+          <w:rFonts w:ascii="Georgia" w:cs="Georgia" w:eastAsia="Georgia" w:hAnsi="Georgia"/>
+          <w:color w:val="1a1a1a"/>
+          <w:sz w:val="21"/>
+          <w:szCs w:val="21"/>
+        </w:rPr>
+        <w:t xml:space="preserve"> is an attorney at law and founder of Gabriela Bar Law and AI in Wroclaw, Poland. She advises organizations on the legal and ethical dimensions of trustworthy AI and data protection, serves as an independent ethics advisor on EU research projects, and is recognized in the Lexology Index: Artificial Intelligence 2026. She has been named among Forbes Top 25 Business Lawyers and TOP100 Women in AI, is a member of the Federation des Barreaux d'Europe, and speaks regularly at academic and industry conferences.</w:t>
+      </w:r>
+    </w:p>
+    <w:p>
+      <w:pPr>
+        <w:spacing w:after="130"/>
+        <w:jc w:val="both"/>
+      </w:pPr>
+      <w:r>
+        <w:rPr>
+          <w:rFonts w:ascii="Georgia" w:cs="Georgia" w:eastAsia="Georgia" w:hAnsi="Georgia"/>
+          <w:b/>
+          <w:bCs/>
+          <w:color w:val="1a1a1a"/>
+          <w:sz w:val="21"/>
+          <w:szCs w:val="21"/>
+        </w:rPr>
+        <w:t xml:space="preserve">Phillip Wikes</w:t>
+      </w:r>
+      <w:r>
+        <w:rPr>
+          <w:rFonts w:ascii="Georgia" w:cs="Georgia" w:eastAsia="Georgia" w:hAnsi="Georgia"/>
+          <w:color w:val="1a1a1a"/>
+          <w:sz w:val="21"/>
+          <w:szCs w:val="21"/>
+        </w:rPr>
+        <w:t xml:space="preserve"> is an AI Governance and Cognitive Risk Advisor focused on documentation integrity, evidentiary traceability, and record-level controls in AI-assisted environments. From 2012 to 2025 he served as a Lead Civil Rights Officer at the Maryland Commission on Civil Rights, evaluating discrimination complaints and resolving matters through investigation, mediation, and structured fact-finding under federal HUD and EEOC frameworks. He developed the Justification Review Standard (JRS) and named the risk it addresses, Decision Reconstruction Risk (DRR), and holds an M.S. in Negotiation and Conflict Management.</w:t>
       </w:r>
     </w:p>
     <w:p>

</xml_diff>

<commit_message>
Evidentiary-Deficit: place Gabriela Bar first on the byline
Byline now 'By Gabriela Bar and Phillip Wikes' (subline + docx rebuilt;
also alphabetical). Pitch updated to note her name is listed first. No
long dashes; article content (DRR, five checks, validation) intact.
Tracker logged.

Co-Authored-By: Claude Opus 4.8 <noreply@anthropic.com>
Claude-Session: https://claude.ai/code/session_01W9UtE7X76spacWeSvBH7tv
</commit_message>
<xml_diff>
--- a/research/JRS_Article_Evidentiary_Deficit.docx
+++ b/research/JRS_Article_Evidentiary_Deficit.docx
@@ -64,7 +64,7 @@
           <w:sz w:val="26"/>
           <w:szCs w:val="26"/>
         </w:rPr>
-        <w:t xml:space="preserve">By Phillip Wikes and Gabriela Bar</w:t>
+        <w:t xml:space="preserve">By Gabriela Bar and Phillip Wikes</w:t>
       </w:r>
     </w:p>
     <w:p>
@@ -83,7 +83,7 @@
           <w:sz w:val="18"/>
           <w:szCs w:val="18"/>
         </w:rPr>
-        <w:t xml:space="preserve">Phillip Wikes, AI Governance and Cognitive Risk Advisor, former Lead Civil Rights Officer, Maryland Commission on Civil Rights.  Gabriela Bar, PhD, Attorney at Law, founder of Gabriela Bar Law and AI (Wroclaw), advising on trustworthy AI and data-protection law.</w:t>
+        <w:t xml:space="preserve">Gabriela Bar, PhD, Attorney at Law, founder of Gabriela Bar Law and AI (Wroclaw), advising on trustworthy AI and data-protection law.  Phillip Wikes, AI Governance and Cognitive Risk Advisor, former Lead Civil Rights Officer, Maryland Commission on Civil Rights.</w:t>
       </w:r>
     </w:p>
     <w:p>

</xml_diff>

<commit_message>
Evidentiary-Deficit: rebuild in Bar's voice as lead author; drop label banner
Remove the LEGAL/GOVERNANCE label banner; rewrite subtitle, intro, and
conclusion in Bar's accessible, accountability-forward voice with the EU
frame as the anchor and the US analysis as the comparative edge; retitle
Section V 'European Frame' as the anchoring analysis. Pitch now explains
she is first and lead because her European analysis anchors the piece.
Body substance unchanged; no long dashes; DRR/five-checks/84% intact.
Tracker logged.

Co-Authored-By: Claude Opus 4.8 <noreply@anthropic.com>
Claude-Session: https://claude.ai/code/session_01W9UtE7X76spacWeSvBH7tv
</commit_message>
<xml_diff>
--- a/research/JRS_Article_Evidentiary_Deficit.docx
+++ b/research/JRS_Article_Evidentiary_Deficit.docx
@@ -2,23 +2,6 @@
 <file path=word/document.xml><?xml version="1.0" encoding="utf-8"?>
 <w:document xmlns:wpc="http://schemas.microsoft.com/office/word/2010/wordprocessingCanvas" xmlns:mc="http://schemas.openxmlformats.org/markup-compatibility/2006" xmlns:o="urn:schemas-microsoft-com:office:office" xmlns:r="http://schemas.openxmlformats.org/officeDocument/2006/relationships" xmlns:m="http://schemas.openxmlformats.org/officeDocument/2006/math" xmlns:v="urn:schemas-microsoft-com:vml" xmlns:wp14="http://schemas.microsoft.com/office/word/2010/wordprocessingDrawing" xmlns:wp="http://schemas.openxmlformats.org/drawingml/2006/wordprocessingDrawing" xmlns:w10="urn:schemas-microsoft-com:office:word" xmlns:w="http://schemas.openxmlformats.org/wordprocessingml/2006/main" xmlns:w14="http://schemas.microsoft.com/office/word/2010/wordml" xmlns:w15="http://schemas.microsoft.com/office/word/2012/wordml" xmlns:wpg="http://schemas.microsoft.com/office/word/2010/wordprocessingGroup" xmlns:wpi="http://schemas.microsoft.com/office/word/2010/wordprocessingInk" xmlns:wne="http://schemas.microsoft.com/office/word/2006/wordml" xmlns:wps="http://schemas.microsoft.com/office/word/2010/wordprocessingShape" xmlns:cx="http://schemas.microsoft.com/office/drawing/2014/chartex" xmlns:cx1="http://schemas.microsoft.com/office/drawing/2015/9/8/chartex" xmlns:cx2="http://schemas.microsoft.com/office/drawing/2015/10/21/chartex" xmlns:cx3="http://schemas.microsoft.com/office/drawing/2016/5/9/chartex" xmlns:cx4="http://schemas.microsoft.com/office/drawing/2016/5/10/chartex" xmlns:cx5="http://schemas.microsoft.com/office/drawing/2016/5/11/chartex" xmlns:cx6="http://schemas.microsoft.com/office/drawing/2016/5/12/chartex" xmlns:cx7="http://schemas.microsoft.com/office/drawing/2016/5/13/chartex" xmlns:cx8="http://schemas.microsoft.com/office/drawing/2016/5/14/chartex" xmlns:aink="http://schemas.microsoft.com/office/drawing/2016/ink" xmlns:am3d="http://schemas.microsoft.com/office/drawing/2017/model3d" xmlns:w16cex="http://schemas.microsoft.com/office/word/2018/wordml/cex" xmlns:w16cid="http://schemas.microsoft.com/office/word/2016/wordml/cid" xmlns:w16="http://schemas.microsoft.com/office/word/2018/wordml" xmlns:w16sdtdh="http://schemas.microsoft.com/office/word/2020/wordml/sdtdatahash" xmlns:w16se="http://schemas.microsoft.com/office/word/2015/wordml/symex" mc:Ignorable="w14 w15 wp14">
   <w:body>
-    <w:p>
-      <w:pPr>
-        <w:spacing w:after="120"/>
-      </w:pPr>
-      <w:r>
-        <w:rPr>
-          <w:rFonts w:ascii="Arial" w:cs="Arial" w:eastAsia="Arial" w:hAnsi="Arial"/>
-          <w:b/>
-          <w:bCs/>
-          <w:color w:val="666666"/>
-          <w:spacing w:val="40"/>
-          <w:sz w:val="15"/>
-          <w:szCs w:val="15"/>
-        </w:rPr>
-        <w:t xml:space="preserve">LEGAL / GOVERNANCE AUDIENCE    |    LITIGATION RISK    |    AI-ASSISTED DOCUMENTATION</w:t>
-      </w:r>
-    </w:p>
     <w:p>
       <w:pPr>
         <w:spacing w:after="60"/>
@@ -48,7 +31,7 @@
           <w:sz w:val="22"/>
           <w:szCs w:val="22"/>
         </w:rPr>
-        <w:t xml:space="preserve">How the gap between polished AI narrative and verifiable evidence creates litigation exposure, and how practitioners can ensure defensible records.</w:t>
+        <w:t xml:space="preserve">Why records that cannot explain themselves have become a legal and ethical liability on both sides of the Atlantic, and what accountable documentation now requires.</w:t>
       </w:r>
     </w:p>
     <w:p>
@@ -115,37 +98,7 @@
           <w:sz w:val="21"/>
           <w:szCs w:val="21"/>
         </w:rPr>
-        <w:t xml:space="preserve">One of us spent more than a decade reading discrimination files for a state civil rights agency. The cases that caused the most worry were rarely the ones with an obvious flaw. They were the ones where the file read cleanly, the conclusion sat neatly at the end, and nothing beneath it explained how anyone had arrived there. A record can look finished and still be hollow.</w:t>
-      </w:r>
-    </w:p>
-    <w:p>
-      <w:pPr>
-        <w:spacing w:after="130"/>
-        <w:jc w:val="both"/>
-      </w:pPr>
-      <w:r>
-        <w:rPr>
-          <w:rFonts w:ascii="Georgia" w:cs="Georgia" w:eastAsia="Georgia" w:hAnsi="Georgia"/>
-          <w:color w:val="1a1a1a"/>
-          <w:sz w:val="21"/>
-          <w:szCs w:val="21"/>
-        </w:rPr>
-        <w:t xml:space="preserve">In employment disputes, the written record carries primary evidentiary weight. When it falls short, every other element of the case becomes harder to defend.</w:t>
-      </w:r>
-    </w:p>
-    <w:p>
-      <w:pPr>
-        <w:spacing w:after="130"/>
-        <w:jc w:val="both"/>
-      </w:pPr>
-      <w:r>
-        <w:rPr>
-          <w:rFonts w:ascii="Georgia" w:cs="Georgia" w:eastAsia="Georgia" w:hAnsi="Georgia"/>
-          <w:color w:val="1a1a1a"/>
-          <w:sz w:val="21"/>
-          <w:szCs w:val="21"/>
-        </w:rPr>
-        <w:t xml:space="preserve">An AI-assisted draft reads like a finished record. The sentences are confident, the structure is coherent, and the conclusions sound reasoned. The relevant discovery question is whether the document is tied back to the facts it asserts. That gap, between fluent narrative and verifiable evidence, is the central concern of this article.</w:t>
+        <w:t xml:space="preserve">A record is a kind of promise. It tells whoever reads it later, a regulator, a court, a colleague, the person whose life it describes, that a decision was made for reasons that can be examined. When artificial intelligence drafts the record, that promise is easy to break without anyone noticing. The text looks complete. The reasoning behind it may already be gone.</w:t>
       </w:r>
     </w:p>
     <w:p>
@@ -180,37 +133,52 @@
           <w:sz w:val="21"/>
           <w:szCs w:val="21"/>
         </w:rPr>
-        <w:t xml:space="preserve">, the condition in which a record cannot explain, on its own terms, why a decision was made. The evidentiary deficit is DRR seen from the litigation side: when the reasoning behind a record cannot be reconstructed, the decision cannot be defended.</w:t>
-      </w:r>
-    </w:p>
-    <w:p>
-      <w:pPr>
-        <w:spacing w:after="130"/>
-        <w:jc w:val="both"/>
-      </w:pPr>
-      <w:r>
-        <w:rPr>
-          <w:rFonts w:ascii="Georgia" w:cs="Georgia" w:eastAsia="Georgia" w:hAnsi="Georgia"/>
-          <w:color w:val="1a1a1a"/>
-          <w:sz w:val="21"/>
-          <w:szCs w:val="21"/>
-        </w:rPr>
-        <w:t xml:space="preserve">Courts and regulators have always relied on contemporaneous documentation to test whether a decision was lawful, consistent, and free of bias. As organizations move more of their drafting into AI-assisted tools, the evidentiary integrity of the resulting records becomes a genuine legal issue, not a theoretical one.</w:t>
-      </w:r>
-    </w:p>
-    <w:p>
-      <w:pPr>
-        <w:spacing w:after="130"/>
-        <w:jc w:val="both"/>
-      </w:pPr>
-      <w:r>
-        <w:rPr>
-          <w:rFonts w:ascii="Georgia" w:cs="Georgia" w:eastAsia="Georgia" w:hAnsi="Georgia"/>
-          <w:color w:val="1a1a1a"/>
-          <w:sz w:val="21"/>
-          <w:szCs w:val="21"/>
-        </w:rPr>
-        <w:t xml:space="preserve">AI-assisted documentation is treated as presumptively discoverable. Drafting workflows should be built on that assumption from the start.</w:t>
+        <w:t xml:space="preserve">, the condition in which a record cannot explain, on its own terms, why a decision was made. It is not a technology problem in the usual sense. It is an accountability problem, and accountability is where law, ethics, and trust meet.</w:t>
+      </w:r>
+    </w:p>
+    <w:p>
+      <w:pPr>
+        <w:spacing w:after="130"/>
+        <w:jc w:val="both"/>
+      </w:pPr>
+      <w:r>
+        <w:rPr>
+          <w:rFonts w:ascii="Georgia" w:cs="Georgia" w:eastAsia="Georgia" w:hAnsi="Georgia"/>
+          <w:color w:val="1a1a1a"/>
+          <w:sz w:val="21"/>
+          <w:szCs w:val="21"/>
+        </w:rPr>
+        <w:t xml:space="preserve">One of us spent more than a decade reading such records after the fact, for a civil rights agency, and saw the same pattern repeat: the decision was often sound, and the record could not show why. The other has spent a career helping organizations build governance that anticipates regulation rather than reacting to it. From both vantage points the conclusion is the same. As AI drafts more of the documents behind consequential decisions, the evidence that would let anyone reconstruct those decisions is quietly disappearing.</w:t>
+      </w:r>
+    </w:p>
+    <w:p>
+      <w:pPr>
+        <w:spacing w:after="130"/>
+        <w:jc w:val="both"/>
+      </w:pPr>
+      <w:r>
+        <w:rPr>
+          <w:rFonts w:ascii="Georgia" w:cs="Georgia" w:eastAsia="Georgia" w:hAnsi="Georgia"/>
+          <w:color w:val="1a1a1a"/>
+          <w:sz w:val="21"/>
+          <w:szCs w:val="21"/>
+        </w:rPr>
+        <w:t xml:space="preserve">We write from both European and United States perspectives, because the exposure is now transatlantic. In Europe, the accountability principle at the heart of the GDPR and the record-keeping expectations of the EU AI Act ask organizations to show, not merely assert, how a decision was reached. In the United States, the same gap surfaces in discovery and in the burden-shifting tests that decide employment and housing disputes. The legal vocabulary differs. The underlying demand is the same: a record must be able to answer for itself.</w:t>
+      </w:r>
+    </w:p>
+    <w:p>
+      <w:pPr>
+        <w:spacing w:after="130"/>
+        <w:jc w:val="both"/>
+      </w:pPr>
+      <w:r>
+        <w:rPr>
+          <w:rFonts w:ascii="Georgia" w:cs="Georgia" w:eastAsia="Georgia" w:hAnsi="Georgia"/>
+          <w:color w:val="1a1a1a"/>
+          <w:sz w:val="21"/>
+          <w:szCs w:val="21"/>
+        </w:rPr>
+        <w:t xml:space="preserve">AI-assisted documentation should be treated as presumptively reviewable, whether by a regulator, an auditor, or a court. The most practical moment to meet that standard is before the record is finalized.</w:t>
       </w:r>
     </w:p>
     <w:p>
@@ -403,7 +371,7 @@
           <w:sz w:val="24"/>
           <w:szCs w:val="24"/>
         </w:rPr>
-        <w:t xml:space="preserve">V. Data Protection and the Transatlantic Frame</w:t>
+        <w:t xml:space="preserve">V. Data Protection and the European Frame</w:t>
       </w:r>
     </w:p>
     <w:p>
@@ -444,7 +412,7 @@
           <w:sz w:val="21"/>
           <w:szCs w:val="21"/>
         </w:rPr>
-        <w:t xml:space="preserve">The precise contours of these European obligations, and how they map onto records generated with general-purpose AI tools, are developed further below by co-author Gabriela Bar.</w:t>
+        <w:t xml:space="preserve">The precise contours of these European obligations, and how they map onto records generated with general-purpose AI tools, are developed in the analysis that anchors this article.</w:t>
       </w:r>
     </w:p>
     <w:p>
@@ -806,7 +774,7 @@
           <w:sz w:val="21"/>
           <w:szCs w:val="21"/>
         </w:rPr>
-        <w:t xml:space="preserve">The drafting tool has changed. The evidentiary test has not. Risk arises where evidentiary traceability is absent, which is to say where Decision Reconstruction Risk is present. Records are evaluated on whether the evidentiary architecture behind them is visible, reproducible, and capable of withstanding scrutiny in both discovery and regulatory review.</w:t>
+        <w:t xml:space="preserve">Risk arises where evidentiary traceability is absent, which is to say where Decision Reconstruction Risk is present. The organizations that will weather the next decade are the ones that treat a record as something that must answer for itself: in a courtroom, before a regulator, and to the person whose life it describes. Records will be judged on whether the reasoning behind them is visible, reproducible, and capable of withstanding independent scrutiny, in Europe and the United States alike.</w:t>
       </w:r>
     </w:p>
     <w:p>

</xml_diff>

<commit_message>
Evidentiary-Deficit: apply reviewer's surgical edits (strengthening pass)
Adopt 8 of the reviewer's edits: operational DRR definition; 'legally
defensible record'; 'Consider' not 'Picture'; add aggregate-invisibility
sentence to pattern risk; bold the three oversight questions; reorder
checklist (preserve before audit); drop promotional URL from the body;
'AI models, each from a different vendor' (keeps cross-vendor
independence). Decline the European 'combine' (not redundant). Keep the
ending. Sync md<->docx. No long dashes; Bar-first byline intact.

Co-Authored-By: Claude Opus 4.8 <noreply@anthropic.com>
Claude-Session: https://claude.ai/code/session_01W9UtE7X76spacWeSvBH7tv
</commit_message>
<xml_diff>
--- a/research/JRS_Article_Evidentiary_Deficit.docx
+++ b/research/JRS_Article_Evidentiary_Deficit.docx
@@ -133,7 +133,7 @@
           <w:sz w:val="21"/>
           <w:szCs w:val="21"/>
         </w:rPr>
-        <w:t xml:space="preserve">, the condition in which a record cannot explain, on its own terms, why a decision was made. It is not a technology problem in the usual sense. It is an accountability problem, and accountability is where law, ethics, and trust meet.</w:t>
+        <w:t xml:space="preserve">, the condition in which a record cannot independently explain why a consequential decision was made. It is not a technology problem in the usual sense. It is an accountability problem, and accountability is where law, ethics, and trust meet.</w:t>
       </w:r>
     </w:p>
     <w:p>
@@ -260,7 +260,7 @@
           <w:sz w:val="21"/>
           <w:szCs w:val="21"/>
         </w:rPr>
-        <w:t xml:space="preserve">A record must do more than state a conclusion. It has to show the factual basis behind that conclusion. When the documentation cannot substantiate the reasoning it claims to reflect, the organization loses the very evidence it needs to defend the decision.</w:t>
+        <w:t xml:space="preserve">A legally defensible record must do more than state a conclusion. It has to show the factual basis behind that conclusion. When the documentation cannot substantiate the reasoning it claims to reflect, the organization loses the very evidence it needs to defend the decision.</w:t>
       </w:r>
     </w:p>
     <w:p>
@@ -307,7 +307,7 @@
           <w:sz w:val="21"/>
           <w:szCs w:val="21"/>
         </w:rPr>
-        <w:t xml:space="preserve">When the same tool generates both the narrative and its supporting justification, the record becomes self-referential and can be functionally indistinguishable from post hoc rationalization. Picture a manager who prompts the model to draft a termination justification, then prompts the same model to supply the supporting facts. The resulting file is internally consistent, and it cannot be tied to independent evidence. In discovery, unsupported assertions are treated as post hoc rationalization, particularly where the drafting record shows AI-generated narrative introduced after the underlying decision was already made.</w:t>
+        <w:t xml:space="preserve">When the same tool generates both the narrative and its supporting justification, the record becomes self-referential and can be functionally indistinguishable from post hoc rationalization. Consider a manager who prompts the model to draft a termination justification, then prompts the same model to supply the supporting facts. The resulting file is internally consistent, and it cannot be tied to independent evidence. In discovery, unsupported assertions are treated as post hoc rationalization, particularly where the drafting record shows AI-generated narrative introduced after the underlying decision was already made.</w:t>
       </w:r>
     </w:p>
     <w:p>
@@ -354,7 +354,7 @@
           <w:sz w:val="21"/>
           <w:szCs w:val="21"/>
         </w:rPr>
-        <w:t xml:space="preserve">AI tools reproduce language patterns at scale. Pattern risk emerges when subjective descriptors such as “cultural fit,” “struggles with change,” or “attitude” recur across individuals sharing protected characteristics. What looks like a stylistic quirk in one file can, in aggregate, support an inference of systemic bias. Aggregate uniformity that would once have taken years of individual drafting to produce can now emerge within a single quarter of AI-assisted writing. Courts have recognized that patterns across records may be used to establish systemic discrimination or discriminatory intent under both disparate treatment and disparate impact analysis.</w:t>
+        <w:t xml:space="preserve">AI tools reproduce language patterns at scale. Pattern risk emerges when subjective descriptors such as “cultural fit,” “struggles with change,” or “attitude” recur across individuals sharing protected characteristics. What looks like a stylistic quirk in one file can, in aggregate, support an inference of systemic bias. Aggregate uniformity that would once have taken years of individual drafting to produce can now emerge within a single quarter of AI-assisted writing. Because the risk lives in the aggregate, it can pass every individual review and become visible only when records are examined together. Courts have recognized that patterns across records may be used to establish systemic discrimination or discriminatory intent under both disparate treatment and disparate impact analysis.</w:t>
       </w:r>
     </w:p>
     <w:p>
@@ -444,7 +444,27 @@
           <w:sz w:val="21"/>
           <w:szCs w:val="21"/>
         </w:rPr>
-        <w:t xml:space="preserve">A defensible record should be able to answer three questions on its face. Can the record be understood independently of its author? Are its conclusions supported by verifiable, non-AI-generated evidence? Can a neutral reviewer reconstruct the reasoning without additional explanation? If any of these questions cannot be answered, the record is incomplete, regardless of how polished it reads. These questions operationalize Decision Reconstruction Risk: a record that cannot answer them carries DRR into every proceeding that later relies on it. Periodic sampling across authors and business units helps surface drift before it becomes a pattern.</w:t>
+        <w:t xml:space="preserve">A defensible record should be able to answer three questions on its face. </w:t>
+      </w:r>
+      <w:r>
+        <w:rPr>
+          <w:rFonts w:ascii="Georgia" w:cs="Georgia" w:eastAsia="Georgia" w:hAnsi="Georgia"/>
+          <w:b/>
+          <w:bCs/>
+          <w:color w:val="1a1a1a"/>
+          <w:sz w:val="21"/>
+          <w:szCs w:val="21"/>
+        </w:rPr>
+        <w:t xml:space="preserve">Can the record be understood independently of its author? Are its conclusions supported by verifiable, non-AI-generated evidence? Can a neutral reviewer reconstruct the reasoning without additional explanation?</w:t>
+      </w:r>
+      <w:r>
+        <w:rPr>
+          <w:rFonts w:ascii="Georgia" w:cs="Georgia" w:eastAsia="Georgia" w:hAnsi="Georgia"/>
+          <w:color w:val="1a1a1a"/>
+          <w:sz w:val="21"/>
+          <w:szCs w:val="21"/>
+        </w:rPr>
+        <w:t xml:space="preserve"> If any of these questions cannot be answered, the record is incomplete, regardless of how polished it reads. These questions operationalize Decision Reconstruction Risk: a record that cannot answer them carries DRR into every proceeding that later relies on it. Periodic sampling across authors and business units helps surface drift before it becomes a pattern.</w:t>
       </w:r>
     </w:p>
     <w:p>
@@ -690,7 +710,7 @@
           <w:sz w:val="21"/>
           <w:szCs w:val="21"/>
         </w:rPr>
-        <w:t xml:space="preserve">Audit periodically for repeated subjective language across authors and business units.</w:t>
+        <w:t xml:space="preserve">Preserve draft history, prompts, and tool-usage records for discovery.</w:t>
       </w:r>
     </w:p>
     <w:p>
@@ -716,7 +736,7 @@
           <w:sz w:val="21"/>
           <w:szCs w:val="21"/>
         </w:rPr>
-        <w:t xml:space="preserve">Preserve draft history, prompts, and tool-usage records for discovery.</w:t>
+        <w:t xml:space="preserve">Audit periodically for repeated subjective language across authors and business units.</w:t>
       </w:r>
     </w:p>
     <w:p>
@@ -874,22 +894,22 @@
           <w:sz w:val="21"/>
           <w:szCs w:val="21"/>
         </w:rPr>
-        <w:t xml:space="preserve">JRS is in structured validation. Independent reviewers across 8 countries on 5 continents have completed structured reviews. Independent raters reached substantial agreement under a pre-registered analysis. Three independent AI providers applied the standard to the same records and agreed 84% of the time across 15 constructed records, a reproducibility signal that is distinct from accuracy. A related article is forthcoming in CEP Magazine in November. These results support reproducible application; they do not yet establish accuracy or real-world effectiveness, which are later stages of the program.</w:t>
-      </w:r>
-    </w:p>
-    <w:p>
-      <w:pPr>
-        <w:spacing w:after="130"/>
-        <w:jc w:val="both"/>
-      </w:pPr>
-      <w:r>
-        <w:rPr>
-          <w:rFonts w:ascii="Georgia" w:cs="Georgia" w:eastAsia="Georgia" w:hAnsi="Georgia"/>
-          <w:color w:val="1a1a1a"/>
-          <w:sz w:val="21"/>
-          <w:szCs w:val="21"/>
-        </w:rPr>
-        <w:t xml:space="preserve">JRS operates within existing HR, compliance, investigations, audit, and legal review processes. No specialized software or procedural redesign required. Learn more: https://jrsstandard.com</w:t>
+        <w:t xml:space="preserve">JRS is in structured validation. Independent reviewers across 8 countries on 5 continents have completed structured reviews. Independent raters reached substantial agreement under a pre-registered analysis. Three independent AI models, each from a different vendor, applied the standard to the same records and agreed 84% of the time across 15 constructed records, a reproducibility signal that is distinct from accuracy. A related article is forthcoming in CEP Magazine in November. These results support reproducible application; they do not yet establish accuracy or real-world effectiveness, which are later stages of the program.</w:t>
+      </w:r>
+    </w:p>
+    <w:p>
+      <w:pPr>
+        <w:spacing w:after="130"/>
+        <w:jc w:val="both"/>
+      </w:pPr>
+      <w:r>
+        <w:rPr>
+          <w:rFonts w:ascii="Georgia" w:cs="Georgia" w:eastAsia="Georgia" w:hAnsi="Georgia"/>
+          <w:color w:val="1a1a1a"/>
+          <w:sz w:val="21"/>
+          <w:szCs w:val="21"/>
+        </w:rPr>
+        <w:t xml:space="preserve">JRS operates within existing HR, compliance, investigations, audit, and legal review processes. No specialized software or procedural redesign required.</w:t>
       </w:r>
     </w:p>
     <w:p>

</xml_diff>

<commit_message>
Evidentiary-Deficit: introduce 'Right to Know Why' as emerging principle in Conclusion
Per reviewer feedback: arrive at 'The Right to Know Why' late, as a
synthesis of existing doctrine (discovery, evidentiary sufficiency, GDPR
accountability, EU AI Act), explicitly not a new legal right, and not the
opening thesis. Two synthesis paragraphs added before the kept ending;
feedback's em-dashes replaced with colons. Aligns the article with the
co-author pitch's vision. md+docx rebuilt; Bar-first byline intact; no
long dashes. Tracker logged.

Co-Authored-By: Claude Opus 4.8 <noreply@anthropic.com>
Claude-Session: https://claude.ai/code/session_01W9UtE7X76spacWeSvBH7tv
</commit_message>
<xml_diff>
--- a/research/JRS_Article_Evidentiary_Deficit.docx
+++ b/research/JRS_Article_Evidentiary_Deficit.docx
@@ -795,6 +795,56 @@
           <w:szCs w:val="21"/>
         </w:rPr>
         <w:t xml:space="preserve">Risk arises where evidentiary traceability is absent, which is to say where Decision Reconstruction Risk is present. The organizations that will weather the next decade are the ones that treat a record as something that must answer for itself: in a courtroom, before a regulator, and to the person whose life it describes. Records will be judged on whether the reasoning behind them is visible, reproducible, and capable of withstanding independent scrutiny, in Europe and the United States alike.</w:t>
+      </w:r>
+    </w:p>
+    <w:p>
+      <w:pPr>
+        <w:spacing w:after="130"/>
+        <w:jc w:val="both"/>
+      </w:pPr>
+      <w:r>
+        <w:rPr>
+          <w:rFonts w:ascii="Georgia" w:cs="Georgia" w:eastAsia="Georgia" w:hAnsi="Georgia"/>
+          <w:color w:val="1a1a1a"/>
+          <w:sz w:val="21"/>
+          <w:szCs w:val="21"/>
+        </w:rPr>
+        <w:t xml:space="preserve">Taken together, these legal and regulatory currents point past any single jurisdiction toward a common governance principle. When AI contributes to a consequential decision, the person affected should be able to understand the basis for it, and the organization should be able to reconstruct and defend it from the record. This expectation can be captured in a single phrase, </w:t>
+      </w:r>
+      <w:r>
+        <w:rPr>
+          <w:rFonts w:ascii="Georgia" w:cs="Georgia" w:eastAsia="Georgia" w:hAnsi="Georgia"/>
+          <w:b/>
+          <w:bCs/>
+          <w:color w:val="1a1a1a"/>
+          <w:sz w:val="21"/>
+          <w:szCs w:val="21"/>
+        </w:rPr>
+        <w:t xml:space="preserve">the Right to Know Why</w:t>
+      </w:r>
+      <w:r>
+        <w:rPr>
+          <w:rFonts w:ascii="Georgia" w:cs="Georgia" w:eastAsia="Georgia" w:hAnsi="Georgia"/>
+          <w:color w:val="1a1a1a"/>
+          <w:sz w:val="21"/>
+          <w:szCs w:val="21"/>
+        </w:rPr>
+        <w:t xml:space="preserve">: not a new legal doctrine, but a concise name for accountability expectations that already run through discovery, evidentiary sufficiency, the GDPR's accountability principle, and the record-keeping demands of the EU AI Act.</w:t>
+      </w:r>
+    </w:p>
+    <w:p>
+      <w:pPr>
+        <w:spacing w:after="130"/>
+        <w:jc w:val="both"/>
+      </w:pPr>
+      <w:r>
+        <w:rPr>
+          <w:rFonts w:ascii="Georgia" w:cs="Georgia" w:eastAsia="Georgia" w:hAnsi="Georgia"/>
+          <w:color w:val="1a1a1a"/>
+          <w:sz w:val="21"/>
+          <w:szCs w:val="21"/>
+        </w:rPr>
+        <w:t xml:space="preserve">Whether the question is put through American evidentiary law or European fundamental-rights frameworks, it converges on the same test: can the decision still explain itself? When it cannot, meaningful accountability is compromised, both for the institution that must defend the decision and for the person entitled to understand it. Naming that test plainly is what the Right to Know Why offers to courts, regulators, organizations, and the people whose lives consequential decisions affect.</w:t>
       </w:r>
     </w:p>
     <w:p>

</xml_diff>

<commit_message>
Evidentiary-Deficit: add governance-depth enhancements (thesis, DRR-as-governance-failure, public interest, public confidence)
Adopt 4 high-value prose additions from reviewer feedback: page-one
thesis line; DRR reframed as a governance failure; Section II
public-interest + survives-scrutiny expansion; Section VII
public-confidence sentence. Decline bloat/over-claim items (duplicate
intro subsection, new section, ASCII diagrams, coined 'Documentation
Durability'/'Decision Defensibility Lifecycle'). Keep opening + ending +
Right-to-Know-Why synthesis. md+docx rebuilt; no long dashes. Tracker
logged.

Co-Authored-By: Claude Opus 4.8 <noreply@anthropic.com>
Claude-Session: https://claude.ai/code/session_01W9UtE7X76spacWeSvBH7tv
</commit_message>
<xml_diff>
--- a/research/JRS_Article_Evidentiary_Deficit.docx
+++ b/research/JRS_Article_Evidentiary_Deficit.docx
@@ -113,6 +113,21 @@
           <w:sz w:val="21"/>
           <w:szCs w:val="21"/>
         </w:rPr>
+        <w:t xml:space="preserve">Every consequential decision is eventually questioned. The only uncertainty is whether the record will still be capable of explaining and defending it.</w:t>
+      </w:r>
+    </w:p>
+    <w:p>
+      <w:pPr>
+        <w:spacing w:after="130"/>
+        <w:jc w:val="both"/>
+      </w:pPr>
+      <w:r>
+        <w:rPr>
+          <w:rFonts w:ascii="Georgia" w:cs="Georgia" w:eastAsia="Georgia" w:hAnsi="Georgia"/>
+          <w:color w:val="1a1a1a"/>
+          <w:sz w:val="21"/>
+          <w:szCs w:val="21"/>
+        </w:rPr>
         <w:t xml:space="preserve">This failure has a name we use throughout: </w:t>
       </w:r>
       <w:r>
@@ -133,7 +148,7 @@
           <w:sz w:val="21"/>
           <w:szCs w:val="21"/>
         </w:rPr>
-        <w:t xml:space="preserve">, the condition in which a record cannot independently explain why a consequential decision was made. It is not a technology problem in the usual sense. It is an accountability problem, and accountability is where law, ethics, and trust meet.</w:t>
+        <w:t xml:space="preserve">, the condition in which a record cannot independently explain why a consequential decision was made. It is not a technology problem in the usual sense. It is an accountability problem, and accountability is where law, ethics, and trust meet. DRR is not simply a documentation problem. It is a governance failure: when the reasoning behind a consequential decision can no longer be independently reconstructed, accountability shifts from contemporaneous evidence to memory, opinion, or institutional credibility, which is precisely the condition modern governance seeks to avoid.</w:t>
       </w:r>
     </w:p>
     <w:p>
@@ -265,6 +280,21 @@
     </w:p>
     <w:p>
       <w:pPr>
+        <w:spacing w:after="130"/>
+        <w:jc w:val="both"/>
+      </w:pPr>
+      <w:r>
+        <w:rPr>
+          <w:rFonts w:ascii="Georgia" w:cs="Georgia" w:eastAsia="Georgia" w:hAnsi="Georgia"/>
+          <w:color w:val="1a1a1a"/>
+          <w:sz w:val="21"/>
+          <w:szCs w:val="21"/>
+        </w:rPr>
+        <w:t xml:space="preserve">Reconstructability serves public interests as much as organizational ones. It preserves an affected person's ability to understand how a decision was reached, and it gives reviewers, courts, regulators, and oversight bodies an evidentiary basis for independent evaluation. A well-supported record survives many forms of scrutiny, internal review, complaint investigation, regulatory examination, discovery, judicial proceedings, and later historical review, while a poorly supported one may fail each of them even when the underlying decision was sound.</w:t>
+      </w:r>
+    </w:p>
+    <w:p>
+      <w:pPr>
         <w:pStyle w:val="Heading2"/>
         <w:spacing w:after="90" w:before="220"/>
       </w:pPr>
@@ -512,6 +542,21 @@
           <w:szCs w:val="21"/>
         </w:rPr>
         <w:t xml:space="preserve">Expect discovery requests aimed at the drafting layer itself, including prompt logs, draft versions, tool-usage records, and reviewer activity. ESI obligations now routinely include such material. Regulators tend to arrive at an adjacent conclusion: uniform language across files can be read as evidence of a process rather than of individualized judgment, and the absence of records-of-processing detail is treated as an independent compliance failure.</w:t>
+      </w:r>
+    </w:p>
+    <w:p>
+      <w:pPr>
+        <w:spacing w:after="130"/>
+        <w:jc w:val="both"/>
+      </w:pPr>
+      <w:r>
+        <w:rPr>
+          <w:rFonts w:ascii="Georgia" w:cs="Georgia" w:eastAsia="Georgia" w:hAnsi="Georgia"/>
+          <w:color w:val="1a1a1a"/>
+          <w:sz w:val="21"/>
+          <w:szCs w:val="21"/>
+        </w:rPr>
+        <w:t xml:space="preserve">These failures create risks beyond litigation exposure. They diminish an institution's capacity to explain its decisions to the people affected by them, and with it the transparency, accountability, and public confidence on which the institution depends.</w:t>
       </w:r>
     </w:p>
     <w:p>

</xml_diff>

<commit_message>
research: fidelity fix - Evidentiary-Deficit article, identity swap ONLY (3/57 paragraphs), intro restored verbatim, no drift
Co-Authored-By: Claude Opus 4.8 <noreply@anthropic.com>
Claude-Session: https://claude.ai/code/session_01W9UtE7X76spacWeSvBH7tv
</commit_message>
<xml_diff>
--- a/research/JRS_Article_Evidentiary_Deficit.docx
+++ b/research/JRS_Article_Evidentiary_Deficit.docx
@@ -66,7 +66,7 @@
           <w:sz w:val="18"/>
           <w:szCs w:val="18"/>
         </w:rPr>
-        <w:t xml:space="preserve">Gabriela Zanfir-Fortuna, PhD, Vice President for Global Privacy at the Future of Privacy Forum, formerly of the European Data Protection Supervisor, writing on global data-protection law and accountability.  Phillip Wikes, AI Governance and Cognitive Risk Advisor, former Lead Civil Rights Officer, Maryland Commission on Civil Rights.</w:t>
+        <w:t xml:space="preserve">Gabriela Zanfir-Fortuna, PhD, Vice President for Global Privacy at the Future of Privacy Forum, advising on global data-protection law and accountability.  Phillip Wikes, AI Governance and Cognitive Risk Advisor, former Lead Civil Rights Officer, Maryland Commission on Civil Rights.</w:t>
       </w:r>
     </w:p>
     <w:p>
@@ -163,7 +163,7 @@
           <w:sz w:val="21"/>
           <w:szCs w:val="21"/>
         </w:rPr>
-        <w:t xml:space="preserve">One of us spent more than a decade reading such records after the fact, for a civil rights agency, and saw the same pattern repeat: the decision was often sound, and the record could not show why. The other has spent a career at the center of data-protection law across Europe and the United States, in enforcement, in litigation before the Court of Justice of the European Union, and in scholarship on the rights of the person a record describes. From both vantage points the conclusion is the same. As AI drafts more of the documents behind consequential decisions, the evidence that would let anyone reconstruct those decisions is quietly disappearing.</w:t>
+        <w:t xml:space="preserve">One of us spent more than a decade reading such records after the fact, for a civil rights agency, and saw the same pattern repeat: the decision was often sound, and the record could not show why. The other has spent a career helping organizations build governance that anticipates regulation rather than reacting to it. From both vantage points the conclusion is the same. As AI drafts more of the documents behind consequential decisions, the evidence that would let anyone reconstruct those decisions is quietly disappearing.</w:t>
       </w:r>
     </w:p>
     <w:p>
@@ -1079,7 +1079,7 @@
           <w:sz w:val="21"/>
           <w:szCs w:val="21"/>
         </w:rPr>
-        <w:t xml:space="preserve"> is Vice President for Global Privacy at the Future of Privacy Forum, where she leads its work on global data-protection and privacy developments. She previously served at the European Data Protection Supervisor in Brussels, where she was part of the litigation team appearing before the Court of Justice of the European Union and took part in the work of the Article 29 Working Party. Her doctoral research addressed the rights of the data subject and their adjudication. She is an associated researcher at the LSTS Center of Vrije Universiteit Brussel and a guest lecturer at Maastricht University's European Centre on Privacy and Cybersecurity.</w:t>
+        <w:t xml:space="preserve"> is Vice President for Global Privacy at the Future of Privacy Forum. She previously served at the European Data Protection Supervisor in Brussels, where she was part of the litigation team appearing before the Court of Justice of the European Union and took part in the Article 29 Working Party. She holds a PhD on the rights of the data subject and writes and teaches on global data-protection law.</w:t>
       </w:r>
     </w:p>
     <w:p>

</xml_diff>